<commit_message>
Collective strategy doc: document the locked social-card visual identity (v1.1)
Adds section 9b - the Collective's own social-card look (warm off-white,
ink, blue, 'The Collective · Powered by Body Recode' wordmark, style=
collective) - distinct from BR (white/blue/logo) and personal (clay
serif). Rebuilt PDF/docx, synced to dashboard.

Co-Authored-By: Claude Opus 4.8 (1M context) <noreply@anthropic.com>
</commit_message>
<xml_diff>
--- a/public/docs/strategy/collective/collective-gtm-content-strategy-v1.docx
+++ b/public/docs/strategy/collective/collective-gtm-content-strategy-v1.docx
@@ -2,7 +2,7 @@
 <file path=word/document.xml><?xml version="1.0" encoding="utf-8"?>
 <w:document xmlns:w="http://schemas.openxmlformats.org/wordprocessingml/2006/main" xmlns:m="http://schemas.openxmlformats.org/officeDocument/2006/math" xmlns:r="http://schemas.openxmlformats.org/officeDocument/2006/relationships" xmlns:o="urn:schemas-microsoft-com:office:office" xmlns:v="urn:schemas-microsoft-com:vml" xmlns:w10="urn:schemas-microsoft-com:office:word" xmlns:a="http://schemas.openxmlformats.org/drawingml/2006/main" xmlns:pic="http://schemas.openxmlformats.org/drawingml/2006/picture" xmlns:wp="http://schemas.openxmlformats.org/drawingml/2006/wordprocessingDrawing">
   <w:body>
-    <w:bookmarkStart w:id="23" w:name="Xa5cc8efca021f71d78fbf944412ee0ef376b9b8"/>
+    <w:bookmarkStart w:id="24" w:name="Xa5cc8efca021f71d78fbf944412ee0ef376b9b8"/>
     <w:p>
       <w:pPr>
         <w:pStyle w:val="Heading1"/>
@@ -1981,7 +1981,468 @@
       </w:r>
     </w:p>
     <w:bookmarkEnd w:id="18"/>
-    <w:bookmarkStart w:id="19" w:name="what-we-measure"/>
+    <w:bookmarkStart w:id="19" w:name="X815c7a46254c08cea01b16a0f84c2b763f6dbe7"/>
+    <w:p>
+      <w:pPr>
+        <w:pStyle w:val="Heading2"/>
+      </w:pPr>
+      <w:r>
+        <w:t xml:space="preserve">9b. Visual identity - social cards (LOCKED 2026-07-21)</w:t>
+      </w:r>
+    </w:p>
+    <w:p>
+      <w:pPr>
+        <w:pStyle w:val="FirstParagraph"/>
+      </w:pPr>
+      <w:r>
+        <w:t xml:space="preserve">The Collective has its</w:t>
+      </w:r>
+      <w:r>
+        <w:t xml:space="preserve"> </w:t>
+      </w:r>
+      <w:r>
+        <w:rPr>
+          <w:b/>
+          <w:bCs/>
+        </w:rPr>
+        <w:t xml:space="preserve">own</w:t>
+      </w:r>
+      <w:r>
+        <w:t xml:space="preserve"> </w:t>
+      </w:r>
+      <w:r>
+        <w:t xml:space="preserve">social-graphic look, deliberately distinct from Body Recode and from Kade’s personal brand. This is part of</w:t>
+      </w:r>
+      <w:r>
+        <w:t xml:space="preserve"> </w:t>
+      </w:r>
+      <w:r>
+        <w:t xml:space="preserve">“never blur the brands”</w:t>
+      </w:r>
+      <w:r>
+        <w:t xml:space="preserve"> </w:t>
+      </w:r>
+      <w:r>
+        <w:t xml:space="preserve">(section 3) - a Collective post must not look like a BR post.</w:t>
+      </w:r>
+    </w:p>
+    <w:tbl>
+      <w:tblPr>
+        <w:tblStyle w:val="Table"/>
+        <w:tblW w:type="pct" w:w="5000"/>
+        <w:tblLayout w:type="fixed"/>
+        <w:tblLook w:firstRow="1" w:lastRow="0" w:firstColumn="0" w:lastColumn="0" w:noHBand="0" w:noVBand="0" w:val="0020"/>
+      </w:tblPr>
+      <w:tblGrid>
+        <w:gridCol w:w="3960"/>
+        <w:gridCol w:w="3960"/>
+      </w:tblGrid>
+      <w:tr>
+        <w:trPr>
+          <w:tblHeader w:val="on"/>
+        </w:trPr>
+        <w:tc>
+          <w:tcPr/>
+          <w:p>
+            <w:pPr>
+              <w:pStyle w:val="Compact"/>
+            </w:pPr>
+            <w:r>
+              <w:t xml:space="preserve">Brand</w:t>
+            </w:r>
+          </w:p>
+        </w:tc>
+        <w:tc>
+          <w:tcPr/>
+          <w:p>
+            <w:pPr>
+              <w:pStyle w:val="Compact"/>
+            </w:pPr>
+            <w:r>
+              <w:t xml:space="preserve">Social card look</w:t>
+            </w:r>
+          </w:p>
+        </w:tc>
+      </w:tr>
+      <w:tr>
+        <w:tc>
+          <w:tcPr/>
+          <w:p>
+            <w:pPr>
+              <w:pStyle w:val="Compact"/>
+            </w:pPr>
+            <w:r>
+              <w:rPr>
+                <w:b/>
+                <w:bCs/>
+              </w:rPr>
+              <w:t xml:space="preserve">Body Recode</w:t>
+            </w:r>
+            <w:r>
+              <w:t xml:space="preserve"> </w:t>
+            </w:r>
+            <w:r>
+              <w:t xml:space="preserve">(</w:t>
+            </w:r>
+            <w:r>
+              <w:rPr>
+                <w:rStyle w:val="VerbatimChar"/>
+              </w:rPr>
+              <w:t xml:space="preserve">@body_recode_</w:t>
+            </w:r>
+            <w:r>
+              <w:t xml:space="preserve">)</w:t>
+            </w:r>
+          </w:p>
+        </w:tc>
+        <w:tc>
+          <w:tcPr/>
+          <w:p>
+            <w:pPr>
+              <w:pStyle w:val="Compact"/>
+            </w:pPr>
+            <w:r>
+              <w:t xml:space="preserve">Pure white / Signal Blue</w:t>
+            </w:r>
+            <w:r>
+              <w:t xml:space="preserve"> </w:t>
+            </w:r>
+            <w:r>
+              <w:rPr>
+                <w:rStyle w:val="VerbatimChar"/>
+              </w:rPr>
+              <w:t xml:space="preserve">#1B6DFC</w:t>
+            </w:r>
+            <w:r>
+              <w:t xml:space="preserve"> </w:t>
+            </w:r>
+            <w:r>
+              <w:t xml:space="preserve">/ sans-bold /</w:t>
+            </w:r>
+            <w:r>
+              <w:t xml:space="preserve"> </w:t>
+            </w:r>
+            <w:r>
+              <w:rPr>
+                <w:b/>
+                <w:bCs/>
+              </w:rPr>
+              <w:t xml:space="preserve">BR logo</w:t>
+            </w:r>
+          </w:p>
+        </w:tc>
+      </w:tr>
+      <w:tr>
+        <w:tc>
+          <w:tcPr/>
+          <w:p>
+            <w:pPr>
+              <w:pStyle w:val="Compact"/>
+            </w:pPr>
+            <w:r>
+              <w:rPr>
+                <w:b/>
+                <w:bCs/>
+              </w:rPr>
+              <w:t xml:space="preserve">Kade personal</w:t>
+            </w:r>
+            <w:r>
+              <w:t xml:space="preserve"> </w:t>
+            </w:r>
+            <w:r>
+              <w:t xml:space="preserve">(</w:t>
+            </w:r>
+            <w:r>
+              <w:rPr>
+                <w:rStyle w:val="VerbatimChar"/>
+              </w:rPr>
+              <w:t xml:space="preserve">@kade_dunstone_</w:t>
+            </w:r>
+            <w:r>
+              <w:t xml:space="preserve">)</w:t>
+            </w:r>
+          </w:p>
+        </w:tc>
+        <w:tc>
+          <w:tcPr/>
+          <w:p>
+            <w:pPr>
+              <w:pStyle w:val="Compact"/>
+            </w:pPr>
+            <w:r>
+              <w:t xml:space="preserve">Warm</w:t>
+            </w:r>
+            <w:r>
+              <w:t xml:space="preserve"> </w:t>
+            </w:r>
+            <w:r>
+              <w:rPr>
+                <w:b/>
+                <w:bCs/>
+              </w:rPr>
+              <w:t xml:space="preserve">clay</w:t>
+            </w:r>
+            <w:r>
+              <w:t xml:space="preserve"> </w:t>
+            </w:r>
+            <w:r>
+              <w:rPr>
+                <w:rStyle w:val="VerbatimChar"/>
+              </w:rPr>
+              <w:t xml:space="preserve">#F3E9E1</w:t>
+            </w:r>
+            <w:r>
+              <w:t xml:space="preserve"> </w:t>
+            </w:r>
+            <w:r>
+              <w:t xml:space="preserve">/ editorial</w:t>
+            </w:r>
+            <w:r>
+              <w:t xml:space="preserve"> </w:t>
+            </w:r>
+            <w:r>
+              <w:rPr>
+                <w:b/>
+                <w:bCs/>
+              </w:rPr>
+              <w:t xml:space="preserve">serif</w:t>
+            </w:r>
+            <w:r>
+              <w:t xml:space="preserve"> </w:t>
+            </w:r>
+            <w:r>
+              <w:t xml:space="preserve">/ wordmark, no logo</w:t>
+            </w:r>
+          </w:p>
+        </w:tc>
+      </w:tr>
+      <w:tr>
+        <w:tc>
+          <w:tcPr/>
+          <w:p>
+            <w:pPr>
+              <w:pStyle w:val="Compact"/>
+            </w:pPr>
+            <w:r>
+              <w:rPr>
+                <w:b/>
+                <w:bCs/>
+              </w:rPr>
+              <w:t xml:space="preserve">The Collective</w:t>
+            </w:r>
+          </w:p>
+        </w:tc>
+        <w:tc>
+          <w:tcPr/>
+          <w:p>
+            <w:pPr>
+              <w:pStyle w:val="Compact"/>
+            </w:pPr>
+            <w:r>
+              <w:t xml:space="preserve">Warm off-white</w:t>
+            </w:r>
+            <w:r>
+              <w:t xml:space="preserve"> </w:t>
+            </w:r>
+            <w:r>
+              <w:rPr>
+                <w:rStyle w:val="VerbatimChar"/>
+              </w:rPr>
+              <w:t xml:space="preserve">#faf9f7</w:t>
+            </w:r>
+            <w:r>
+              <w:t xml:space="preserve"> </w:t>
+            </w:r>
+            <w:r>
+              <w:t xml:space="preserve">/ ink</w:t>
+            </w:r>
+            <w:r>
+              <w:t xml:space="preserve"> </w:t>
+            </w:r>
+            <w:r>
+              <w:rPr>
+                <w:rStyle w:val="VerbatimChar"/>
+              </w:rPr>
+              <w:t xml:space="preserve">#1a1816</w:t>
+            </w:r>
+            <w:r>
+              <w:t xml:space="preserve"> </w:t>
+            </w:r>
+            <w:r>
+              <w:t xml:space="preserve">/ blue accent</w:t>
+            </w:r>
+            <w:r>
+              <w:t xml:space="preserve"> </w:t>
+            </w:r>
+            <w:r>
+              <w:rPr>
+                <w:rStyle w:val="VerbatimChar"/>
+              </w:rPr>
+              <w:t xml:space="preserve">#1B6DFC</w:t>
+            </w:r>
+            <w:r>
+              <w:t xml:space="preserve"> </w:t>
+            </w:r>
+            <w:r>
+              <w:t xml:space="preserve">/</w:t>
+            </w:r>
+            <w:r>
+              <w:t xml:space="preserve"> </w:t>
+            </w:r>
+            <w:r>
+              <w:rPr>
+                <w:b/>
+                <w:bCs/>
+              </w:rPr>
+              <w:t xml:space="preserve">“The Collective · Powered by Body Recode”</w:t>
+            </w:r>
+            <w:r>
+              <w:t xml:space="preserve"> </w:t>
+            </w:r>
+            <w:r>
+              <w:t xml:space="preserve">wordmark,</w:t>
+            </w:r>
+            <w:r>
+              <w:t xml:space="preserve"> </w:t>
+            </w:r>
+            <w:r>
+              <w:rPr>
+                <w:b/>
+                <w:bCs/>
+              </w:rPr>
+              <w:t xml:space="preserve">NO BR logo</w:t>
+            </w:r>
+          </w:p>
+        </w:tc>
+      </w:tr>
+    </w:tbl>
+    <w:p>
+      <w:pPr>
+        <w:pStyle w:val="BodyText"/>
+      </w:pPr>
+      <w:r>
+        <w:rPr>
+          <w:b/>
+          <w:bCs/>
+        </w:rPr>
+        <w:t xml:space="preserve">The Collective card</w:t>
+      </w:r>
+      <w:r>
+        <w:t xml:space="preserve"> </w:t>
+      </w:r>
+      <w:r>
+        <w:t xml:space="preserve">= the</w:t>
+      </w:r>
+      <w:r>
+        <w:t xml:space="preserve"> </w:t>
+      </w:r>
+      <w:r>
+        <w:rPr>
+          <w:rStyle w:val="VerbatimChar"/>
+        </w:rPr>
+        <w:t xml:space="preserve">/collective</w:t>
+      </w:r>
+      <w:r>
+        <w:t xml:space="preserve"> </w:t>
+      </w:r>
+      <w:r>
+        <w:t xml:space="preserve">page identity ported to a social card: warm paper background, blue eyebrow rule + uppercase label, ink sans-bold headline, muted sub, and the</w:t>
+      </w:r>
+      <w:r>
+        <w:t xml:space="preserve"> </w:t>
+      </w:r>
+      <w:r>
+        <w:t xml:space="preserve">“The Collective · Powered by Body Recode”</w:t>
+      </w:r>
+      <w:r>
+        <w:t xml:space="preserve"> </w:t>
+      </w:r>
+      <w:r>
+        <w:t xml:space="preserve">wordmark at the foot. Matches the warm off-white / dot-grid feel of the marketing site (the dot-grid itself can’t render in the card engine, so the warm bg + wordmark carry the distinction).</w:t>
+      </w:r>
+    </w:p>
+    <w:p>
+      <w:pPr>
+        <w:pStyle w:val="BodyText"/>
+      </w:pPr>
+      <w:r>
+        <w:rPr>
+          <w:b/>
+          <w:bCs/>
+        </w:rPr>
+        <w:t xml:space="preserve">How it’s made:</w:t>
+      </w:r>
+      <w:r>
+        <w:t xml:space="preserve"> </w:t>
+      </w:r>
+      <w:r>
+        <w:rPr>
+          <w:rStyle w:val="VerbatimChar"/>
+        </w:rPr>
+        <w:t xml:space="preserve">bodyrecode.au/api/content/graphic?style=collective&amp;label=...&amp;text=...&amp;sub=...</w:t>
+      </w:r>
+      <w:r>
+        <w:t xml:space="preserve"> </w:t>
+      </w:r>
+      <w:r>
+        <w:t xml:space="preserve">(1080x1080). Collective calendar posts store this URL in the</w:t>
+      </w:r>
+      <w:r>
+        <w:t xml:space="preserve"> </w:t>
+      </w:r>
+      <w:r>
+        <w:rPr>
+          <w:rStyle w:val="VerbatimChar"/>
+        </w:rPr>
+        <w:t xml:space="preserve">graphic</w:t>
+      </w:r>
+      <w:r>
+        <w:t xml:space="preserve"> </w:t>
+      </w:r>
+      <w:r>
+        <w:t xml:space="preserve">field.</w:t>
+      </w:r>
+      <w:r>
+        <w:t xml:space="preserve"> </w:t>
+      </w:r>
+      <w:r>
+        <w:rPr>
+          <w:b/>
+          <w:bCs/>
+        </w:rPr>
+        <w:t xml:space="preserve">Never</w:t>
+      </w:r>
+      <w:r>
+        <w:t xml:space="preserve"> </w:t>
+      </w:r>
+      <w:r>
+        <w:t xml:space="preserve">use</w:t>
+      </w:r>
+      <w:r>
+        <w:t xml:space="preserve"> </w:t>
+      </w:r>
+      <w:r>
+        <w:rPr>
+          <w:rStyle w:val="VerbatimChar"/>
+        </w:rPr>
+        <w:t xml:space="preserve">style=authority</w:t>
+      </w:r>
+      <w:r>
+        <w:t xml:space="preserve"> </w:t>
+      </w:r>
+      <w:r>
+        <w:t xml:space="preserve">(that is the BR blue/white card) for Collective content.</w:t>
+      </w:r>
+    </w:p>
+    <w:p>
+      <w:r>
+        <w:pict>
+          <v:rect style="width:0;height:1.5pt" o:hralign="center" o:hrstd="t" o:hr="t"/>
+        </w:pict>
+      </w:r>
+    </w:p>
+    <w:bookmarkEnd w:id="19"/>
+    <w:bookmarkStart w:id="20" w:name="what-we-measure"/>
     <w:p>
       <w:pPr>
         <w:pStyle w:val="Heading2"/>
@@ -2097,8 +2558,8 @@
         </w:pict>
       </w:r>
     </w:p>
-    <w:bookmarkEnd w:id="19"/>
-    <w:bookmarkStart w:id="20" w:name="Xb6c1caa8e85e9bb97f8c288790f8add1031dedd"/>
+    <w:bookmarkEnd w:id="20"/>
+    <w:bookmarkStart w:id="21" w:name="Xb6c1caa8e85e9bb97f8c288790f8add1031dedd"/>
     <w:p>
       <w:pPr>
         <w:pStyle w:val="Heading2"/>
@@ -2205,8 +2666,8 @@
         </w:pict>
       </w:r>
     </w:p>
-    <w:bookmarkEnd w:id="20"/>
-    <w:bookmarkStart w:id="21" w:name="X4a03071502d87b991c9bd243607da92a735258e"/>
+    <w:bookmarkEnd w:id="21"/>
+    <w:bookmarkStart w:id="22" w:name="X4a03071502d87b991c9bd243607da92a735258e"/>
     <w:p>
       <w:pPr>
         <w:pStyle w:val="Heading2"/>
@@ -2451,8 +2912,8 @@
         </w:pict>
       </w:r>
     </w:p>
-    <w:bookmarkEnd w:id="21"/>
-    <w:bookmarkStart w:id="22" w:name="next-steps-build-order"/>
+    <w:bookmarkEnd w:id="22"/>
+    <w:bookmarkStart w:id="23" w:name="next-steps-build-order"/>
     <w:p>
       <w:pPr>
         <w:pStyle w:val="Heading2"/>
@@ -2584,8 +3045,8 @@
         <w:t xml:space="preserve">from the skeleton in section 12, expanded to real hooks.</w:t>
       </w:r>
     </w:p>
-    <w:bookmarkEnd w:id="22"/>
     <w:bookmarkEnd w:id="23"/>
+    <w:bookmarkEnd w:id="24"/>
     <w:sectPr>
       <w:footnotePr>
         <w:numRestart w:val="eachSect"/>

</xml_diff>